<commit_message>
Apply organizer answers: EOA is a separate network, PPO+EPO counts as PPO
- new EOA final label; config mappings marked organizer_confirmed get high
  confidence (eoa_as: eoa, ppo_epo_as: ppo)
- family/cost-share validation now measures purity against EOA too, so the
  EC prefix (HMO and EOA) is no longer accepted as an HMO marker
- PPO network: 456 plans; EOA 127 ruled out; nothing left unresolved
- docs, open questions, README and Word summary updated
</commit_message>
<xml_diff>
--- a/docs/HiLabs_PTD_C1_C2_Summary.docx
+++ b/docs/HiLabs_PTD_C1_C2_Summary.docx
@@ -39,7 +39,7 @@
         <w:rPr>
           <w:b/>
         </w:rPr>
-        <w:t xml:space="preserve">453 Health Net plans</w:t>
+        <w:t xml:space="preserve">456 Health Net plans</w:t>
       </w:r>
       <w:r>
         <w:t xml:space="preserve"> sharing </w:t>
@@ -233,7 +233,7 @@
           <w:p>
             <w:pPr/>
             <w:r>
-              <w:t xml:space="preserve">453 (452 high confidence, 1 medium)</w:t>
+              <w:t xml:space="preserve">456 (455 high confidence, 1 medium)</w:t>
             </w:r>
           </w:p>
         </w:tc>
@@ -246,7 +246,7 @@
           <w:p>
             <w:pPr/>
             <w:r>
-              <w:t xml:space="preserve">HMO / POS / EPO-only plans ruled out</w:t>
+              <w:t xml:space="preserve">HMO / EOA / POS / EPO-only plans ruled out</w:t>
             </w:r>
           </w:p>
         </w:tc>
@@ -257,7 +257,7 @@
           <w:p>
             <w:pPr/>
             <w:r>
-              <w:t xml:space="preserve">723 / 6 / 0</w:t>
+              <w:t xml:space="preserve">723 / 127 / 6 / 0</w:t>
             </w:r>
           </w:p>
         </w:tc>
@@ -270,7 +270,7 @@
           <w:p>
             <w:pPr/>
             <w:r>
-              <w:t xml:space="preserve">Unresolved plans (flagged, not counted as PPO)</w:t>
+              <w:t xml:space="preserve">Unresolved plans</w:t>
             </w:r>
           </w:p>
         </w:tc>
@@ -281,7 +281,7 @@
           <w:p>
             <w:pPr/>
             <w:r>
-              <w:t xml:space="preserve">130</w:t>
+              <w:t xml:space="preserve">0</w:t>
             </w:r>
           </w:p>
         </w:tc>
@@ -294,7 +294,7 @@
           <w:p>
             <w:pPr/>
             <w:r>
-              <w:t xml:space="preserve">PPO upper bound if every unresolved plan were PPO</w:t>
+              <w:t xml:space="preserve">Plans decided by the organizers' answers</w:t>
             </w:r>
           </w:p>
         </w:tc>
@@ -305,7 +305,7 @@
           <w:p>
             <w:pPr/>
             <w:r>
-              <w:t xml:space="preserve">583</w:t>
+              <w:t xml:space="preserve">130: 127 EOA as a separate network, 3 PPO+EPO as PPO</w:t>
             </w:r>
           </w:p>
         </w:tc>
@@ -362,7 +362,7 @@
           <w:p>
             <w:pPr/>
             <w:r>
-              <w:t xml:space="preserve">59</w:t>
+              <w:t xml:space="preserve">62</w:t>
             </w:r>
           </w:p>
         </w:tc>
@@ -1956,7 +1956,7 @@
         <w:pStyle w:val="Heading2"/>
       </w:pPr>
       <w:r>
-        <w:t xml:space="preserve">C2 network rules: 453 PPO plans, 1 MIXED rate file</w:t>
+        <w:t xml:space="preserve">C2 network rules: 456 PPO plans, 1 MIXED rate file</w:t>
       </w:r>
     </w:p>
     <w:p>
@@ -1975,8 +1975,8 @@
       <w:tblGrid>
         <w:gridCol w:w="750"/>
         <w:gridCol w:w="4920"/>
-        <w:gridCol w:w="1384"/>
-        <w:gridCol w:w="2306"/>
+        <w:gridCol w:w="1630"/>
+        <w:gridCol w:w="2060"/>
       </w:tblGrid>
       <w:tr>
         <w:trPr>
@@ -2008,7 +2008,7 @@
         </w:tc>
         <w:tc>
           <w:tcPr>
-            <w:tcW w:w="1384" w:type="dxa"/>
+            <w:tcW w:w="1630" w:type="dxa"/>
             <w:shd w:val="clear" w:color="auto" w:fill="F2F2F2"/>
           </w:tcPr>
           <w:p>
@@ -2020,7 +2020,7 @@
         </w:tc>
         <w:tc>
           <w:tcPr>
-            <w:tcW w:w="2306" w:type="dxa"/>
+            <w:tcW w:w="2060" w:type="dxa"/>
             <w:shd w:val="clear" w:color="auto" w:fill="F2F2F2"/>
           </w:tcPr>
           <w:p>
@@ -2065,7 +2065,7 @@
         </w:tc>
         <w:tc>
           <w:tcPr>
-            <w:tcW w:w="1384" w:type="dxa"/>
+            <w:tcW w:w="1630" w:type="dxa"/>
           </w:tcPr>
           <w:p>
             <w:pPr/>
@@ -2076,7 +2076,7 @@
         </w:tc>
         <w:tc>
           <w:tcPr>
-            <w:tcW w:w="2306" w:type="dxa"/>
+            <w:tcW w:w="2060" w:type="dxa"/>
           </w:tcPr>
           <w:p>
             <w:pPr/>
@@ -2120,7 +2120,7 @@
         </w:tc>
         <w:tc>
           <w:tcPr>
-            <w:tcW w:w="1384" w:type="dxa"/>
+            <w:tcW w:w="1630" w:type="dxa"/>
           </w:tcPr>
           <w:p>
             <w:pPr/>
@@ -2131,7 +2131,7 @@
         </w:tc>
         <w:tc>
           <w:tcPr>
-            <w:tcW w:w="2306" w:type="dxa"/>
+            <w:tcW w:w="2060" w:type="dxa"/>
           </w:tcPr>
           <w:p>
             <w:pPr/>
@@ -2160,13 +2160,243 @@
           <w:p>
             <w:pPr/>
             <w:r>
-              <w:t xml:space="preserve">Unresolved word (EOA, PPO+EPO, HSP); mapped only by a config switch, never guessed</w:t>
-            </w:r>
-          </w:p>
-        </w:tc>
-        <w:tc>
-          <w:tcPr>
-            <w:tcW w:w="1384" w:type="dxa"/>
+              <w:t xml:space="preserve">Special word (EOA, PPO+EPO, HSP); mapped only by a config switch set from the organizers' answers, never guessed</w:t>
+            </w:r>
+          </w:p>
+        </w:tc>
+        <w:tc>
+          <w:tcPr>
+            <w:tcW w:w="1630" w:type="dxa"/>
+          </w:tcPr>
+          <w:p>
+            <w:pPr/>
+            <w:r>
+              <w:t xml:space="preserve">high (organizer-confirmed)</w:t>
+            </w:r>
+          </w:p>
+        </w:tc>
+        <w:tc>
+          <w:tcPr>
+            <w:tcW w:w="2060" w:type="dxa"/>
+          </w:tcPr>
+          <w:p>
+            <w:pPr/>
+            <w:r>
+              <w:t xml:space="preserve">130</w:t>
+            </w:r>
+          </w:p>
+        </w:tc>
+      </w:tr>
+      <w:tr>
+        <w:tc>
+          <w:tcPr>
+            <w:tcW w:w="750" w:type="dxa"/>
+          </w:tcPr>
+          <w:p>
+            <w:pPr/>
+            <w:r>
+              <w:t xml:space="preserve">P2</w:t>
+            </w:r>
+          </w:p>
+        </w:tc>
+        <w:tc>
+          <w:tcPr>
+            <w:tcW w:w="4920" w:type="dxa"/>
+          </w:tcPr>
+          <w:p>
+            <w:pPr/>
+            <w:r>
+              <w:t xml:space="preserve">Network word in the rate-file name</w:t>
+            </w:r>
+          </w:p>
+        </w:tc>
+        <w:tc>
+          <w:tcPr>
+            <w:tcW w:w="1630" w:type="dxa"/>
+          </w:tcPr>
+          <w:p>
+            <w:pPr/>
+            <w:r>
+              <w:t xml:space="preserve">high</w:t>
+            </w:r>
+          </w:p>
+        </w:tc>
+        <w:tc>
+          <w:tcPr>
+            <w:tcW w:w="2060" w:type="dxa"/>
+          </w:tcPr>
+          <w:p>
+            <w:pPr/>
+            <w:r>
+              <w:t xml:space="preserve">0 (no file names carry one)</w:t>
+            </w:r>
+          </w:p>
+        </w:tc>
+      </w:tr>
+      <w:tr>
+        <w:tc>
+          <w:tcPr>
+            <w:tcW w:w="750" w:type="dxa"/>
+          </w:tcPr>
+          <w:p>
+            <w:pPr/>
+            <w:r>
+              <w:t xml:space="preserve">P3</w:t>
+            </w:r>
+          </w:p>
+        </w:tc>
+        <w:tc>
+          <w:tcPr>
+            <w:tcW w:w="4920" w:type="dxa"/>
+          </w:tcPr>
+          <w:p>
+            <w:pPr/>
+            <w:r>
+              <w:t xml:space="preserve">Legal-entity rule on issuer/sponsor</w:t>
+            </w:r>
+          </w:p>
+        </w:tc>
+        <w:tc>
+          <w:tcPr>
+            <w:tcW w:w="1630" w:type="dxa"/>
+          </w:tcPr>
+          <w:p>
+            <w:pPr/>
+            <w:r>
+              <w:t xml:space="preserve">medium</w:t>
+            </w:r>
+          </w:p>
+        </w:tc>
+        <w:tc>
+          <w:tcPr>
+            <w:tcW w:w="2060" w:type="dxa"/>
+          </w:tcPr>
+          <w:p>
+            <w:pPr/>
+            <w:r>
+              <w:t xml:space="preserve">0 (all say "Healthnet, LLC")</w:t>
+            </w:r>
+          </w:p>
+        </w:tc>
+      </w:tr>
+      <w:tr>
+        <w:tc>
+          <w:tcPr>
+            <w:tcW w:w="750" w:type="dxa"/>
+          </w:tcPr>
+          <w:p>
+            <w:pPr/>
+            <w:r>
+              <w:t xml:space="preserve">P4</w:t>
+            </w:r>
+          </w:p>
+        </w:tc>
+        <w:tc>
+          <w:tcPr>
+            <w:tcW w:w="4920" w:type="dxa"/>
+          </w:tcPr>
+          <w:p>
+            <w:pPr/>
+            <w:r>
+              <w:t xml:space="preserve">Product family checked against the data (100% one type, at least 5 plans)</w:t>
+            </w:r>
+          </w:p>
+        </w:tc>
+        <w:tc>
+          <w:tcPr>
+            <w:tcW w:w="1630" w:type="dxa"/>
+          </w:tcPr>
+          <w:p>
+            <w:pPr/>
+            <w:r>
+              <w:t xml:space="preserve">medium</w:t>
+            </w:r>
+          </w:p>
+        </w:tc>
+        <w:tc>
+          <w:tcPr>
+            <w:tcW w:w="2060" w:type="dxa"/>
+          </w:tcPr>
+          <w:p>
+            <w:pPr/>
+            <w:r>
+              <w:t xml:space="preserve">4</w:t>
+            </w:r>
+          </w:p>
+        </w:tc>
+      </w:tr>
+      <w:tr>
+        <w:tc>
+          <w:tcPr>
+            <w:tcW w:w="750" w:type="dxa"/>
+          </w:tcPr>
+          <w:p>
+            <w:pPr/>
+            <w:r>
+              <w:t xml:space="preserve">P5</w:t>
+            </w:r>
+          </w:p>
+        </w:tc>
+        <w:tc>
+          <w:tcPr>
+            <w:tcW w:w="4920" w:type="dxa"/>
+          </w:tcPr>
+          <w:p>
+            <w:pPr/>
+            <w:r>
+              <w:t xml:space="preserve">All of the plan's files are confidently one type</w:t>
+            </w:r>
+          </w:p>
+        </w:tc>
+        <w:tc>
+          <w:tcPr>
+            <w:tcW w:w="1630" w:type="dxa"/>
+          </w:tcPr>
+          <w:p>
+            <w:pPr/>
+            <w:r>
+              <w:t xml:space="preserve">medium</w:t>
+            </w:r>
+          </w:p>
+        </w:tc>
+        <w:tc>
+          <w:tcPr>
+            <w:tcW w:w="2060" w:type="dxa"/>
+          </w:tcPr>
+          <w:p>
+            <w:pPr/>
+            <w:r>
+              <w:t xml:space="preserve">0 (the CA file is MIXED)</w:t>
+            </w:r>
+          </w:p>
+        </w:tc>
+      </w:tr>
+      <w:tr>
+        <w:tc>
+          <w:tcPr>
+            <w:tcW w:w="750" w:type="dxa"/>
+          </w:tcPr>
+          <w:p>
+            <w:pPr/>
+            <w:r>
+              <w:t xml:space="preserve">P6</w:t>
+            </w:r>
+          </w:p>
+        </w:tc>
+        <w:tc>
+          <w:tcPr>
+            <w:tcW w:w="4920" w:type="dxa"/>
+          </w:tcPr>
+          <w:p>
+            <w:pPr/>
+            <w:r>
+              <w:t xml:space="preserve">Cost-share pattern, if at least 95% precise</w:t>
+            </w:r>
+          </w:p>
+        </w:tc>
+        <w:tc>
+          <w:tcPr>
+            <w:tcW w:w="1630" w:type="dxa"/>
           </w:tcPr>
           <w:p>
             <w:pPr/>
@@ -2177,237 +2407,7 @@
         </w:tc>
         <w:tc>
           <w:tcPr>
-            <w:tcW w:w="2306" w:type="dxa"/>
-          </w:tcPr>
-          <w:p>
-            <w:pPr/>
-            <w:r>
-              <w:t xml:space="preserve">130</w:t>
-            </w:r>
-          </w:p>
-        </w:tc>
-      </w:tr>
-      <w:tr>
-        <w:tc>
-          <w:tcPr>
-            <w:tcW w:w="750" w:type="dxa"/>
-          </w:tcPr>
-          <w:p>
-            <w:pPr/>
-            <w:r>
-              <w:t xml:space="preserve">P2</w:t>
-            </w:r>
-          </w:p>
-        </w:tc>
-        <w:tc>
-          <w:tcPr>
-            <w:tcW w:w="4920" w:type="dxa"/>
-          </w:tcPr>
-          <w:p>
-            <w:pPr/>
-            <w:r>
-              <w:t xml:space="preserve">Network word in the rate-file name</w:t>
-            </w:r>
-          </w:p>
-        </w:tc>
-        <w:tc>
-          <w:tcPr>
-            <w:tcW w:w="1384" w:type="dxa"/>
-          </w:tcPr>
-          <w:p>
-            <w:pPr/>
-            <w:r>
-              <w:t xml:space="preserve">high</w:t>
-            </w:r>
-          </w:p>
-        </w:tc>
-        <w:tc>
-          <w:tcPr>
-            <w:tcW w:w="2306" w:type="dxa"/>
-          </w:tcPr>
-          <w:p>
-            <w:pPr/>
-            <w:r>
-              <w:t xml:space="preserve">0 (no file names carry one)</w:t>
-            </w:r>
-          </w:p>
-        </w:tc>
-      </w:tr>
-      <w:tr>
-        <w:tc>
-          <w:tcPr>
-            <w:tcW w:w="750" w:type="dxa"/>
-          </w:tcPr>
-          <w:p>
-            <w:pPr/>
-            <w:r>
-              <w:t xml:space="preserve">P3</w:t>
-            </w:r>
-          </w:p>
-        </w:tc>
-        <w:tc>
-          <w:tcPr>
-            <w:tcW w:w="4920" w:type="dxa"/>
-          </w:tcPr>
-          <w:p>
-            <w:pPr/>
-            <w:r>
-              <w:t xml:space="preserve">Legal-entity rule on issuer/sponsor</w:t>
-            </w:r>
-          </w:p>
-        </w:tc>
-        <w:tc>
-          <w:tcPr>
-            <w:tcW w:w="1384" w:type="dxa"/>
-          </w:tcPr>
-          <w:p>
-            <w:pPr/>
-            <w:r>
-              <w:t xml:space="preserve">medium</w:t>
-            </w:r>
-          </w:p>
-        </w:tc>
-        <w:tc>
-          <w:tcPr>
-            <w:tcW w:w="2306" w:type="dxa"/>
-          </w:tcPr>
-          <w:p>
-            <w:pPr/>
-            <w:r>
-              <w:t xml:space="preserve">0 (all say "Healthnet, LLC")</w:t>
-            </w:r>
-          </w:p>
-        </w:tc>
-      </w:tr>
-      <w:tr>
-        <w:tc>
-          <w:tcPr>
-            <w:tcW w:w="750" w:type="dxa"/>
-          </w:tcPr>
-          <w:p>
-            <w:pPr/>
-            <w:r>
-              <w:t xml:space="preserve">P4</w:t>
-            </w:r>
-          </w:p>
-        </w:tc>
-        <w:tc>
-          <w:tcPr>
-            <w:tcW w:w="4920" w:type="dxa"/>
-          </w:tcPr>
-          <w:p>
-            <w:pPr/>
-            <w:r>
-              <w:t xml:space="preserve">Product family checked against the data (100% one type, at least 5 plans)</w:t>
-            </w:r>
-          </w:p>
-        </w:tc>
-        <w:tc>
-          <w:tcPr>
-            <w:tcW w:w="1384" w:type="dxa"/>
-          </w:tcPr>
-          <w:p>
-            <w:pPr/>
-            <w:r>
-              <w:t xml:space="preserve">medium</w:t>
-            </w:r>
-          </w:p>
-        </w:tc>
-        <w:tc>
-          <w:tcPr>
-            <w:tcW w:w="2306" w:type="dxa"/>
-          </w:tcPr>
-          <w:p>
-            <w:pPr/>
-            <w:r>
-              <w:t xml:space="preserve">4</w:t>
-            </w:r>
-          </w:p>
-        </w:tc>
-      </w:tr>
-      <w:tr>
-        <w:tc>
-          <w:tcPr>
-            <w:tcW w:w="750" w:type="dxa"/>
-          </w:tcPr>
-          <w:p>
-            <w:pPr/>
-            <w:r>
-              <w:t xml:space="preserve">P5</w:t>
-            </w:r>
-          </w:p>
-        </w:tc>
-        <w:tc>
-          <w:tcPr>
-            <w:tcW w:w="4920" w:type="dxa"/>
-          </w:tcPr>
-          <w:p>
-            <w:pPr/>
-            <w:r>
-              <w:t xml:space="preserve">All of the plan's files are confidently one type</w:t>
-            </w:r>
-          </w:p>
-        </w:tc>
-        <w:tc>
-          <w:tcPr>
-            <w:tcW w:w="1384" w:type="dxa"/>
-          </w:tcPr>
-          <w:p>
-            <w:pPr/>
-            <w:r>
-              <w:t xml:space="preserve">medium</w:t>
-            </w:r>
-          </w:p>
-        </w:tc>
-        <w:tc>
-          <w:tcPr>
-            <w:tcW w:w="2306" w:type="dxa"/>
-          </w:tcPr>
-          <w:p>
-            <w:pPr/>
-            <w:r>
-              <w:t xml:space="preserve">0 (the CA file is MIXED)</w:t>
-            </w:r>
-          </w:p>
-        </w:tc>
-      </w:tr>
-      <w:tr>
-        <w:tc>
-          <w:tcPr>
-            <w:tcW w:w="750" w:type="dxa"/>
-          </w:tcPr>
-          <w:p>
-            <w:pPr/>
-            <w:r>
-              <w:t xml:space="preserve">P6</w:t>
-            </w:r>
-          </w:p>
-        </w:tc>
-        <w:tc>
-          <w:tcPr>
-            <w:tcW w:w="4920" w:type="dxa"/>
-          </w:tcPr>
-          <w:p>
-            <w:pPr/>
-            <w:r>
-              <w:t xml:space="preserve">Cost-share pattern, if at least 95% precise</w:t>
-            </w:r>
-          </w:p>
-        </w:tc>
-        <w:tc>
-          <w:tcPr>
-            <w:tcW w:w="1384" w:type="dxa"/>
-          </w:tcPr>
-          <w:p>
-            <w:pPr/>
-            <w:r>
-              <w:t xml:space="preserve">low</w:t>
-            </w:r>
-          </w:p>
-        </w:tc>
-        <w:tc>
-          <w:tcPr>
-            <w:tcW w:w="2306" w:type="dxa"/>
+            <w:tcW w:w="2060" w:type="dxa"/>
           </w:tcPr>
           <w:p>
             <w:pPr/>
@@ -2510,7 +2510,7 @@
               <w:rPr>
                 <w:b/>
               </w:rPr>
-              <w:t xml:space="preserve">453</w:t>
+              <w:t xml:space="preserve">456</w:t>
             </w:r>
           </w:p>
         </w:tc>
@@ -2521,7 +2521,7 @@
           <w:p>
             <w:pPr/>
             <w:r>
-              <w:t xml:space="preserve">133</w:t>
+              <w:t xml:space="preserve">136</w:t>
             </w:r>
           </w:p>
         </w:tc>
@@ -2546,6 +2546,15 @@
               </w:rPr>
               <w:t xml:space="preserve">Gold PPO 500/20</w:t>
             </w:r>
+            <w:r>
+              <w:t xml:space="preserve">, </w:t>
+            </w:r>
+            <w:r>
+              <w:rPr>
+                <w:rStyle w:val="CodeChar"/>
+              </w:rPr>
+              <w:t xml:space="preserve">CA L CUS PPO SACRAMENTO CITY USD- EPO</w:t>
+            </w:r>
           </w:p>
         </w:tc>
       </w:tr>
@@ -2615,6 +2624,64 @@
           <w:p>
             <w:pPr/>
             <w:r>
+              <w:t xml:space="preserve">EOA (separate network)</w:t>
+            </w:r>
+          </w:p>
+        </w:tc>
+        <w:tc>
+          <w:tcPr>
+            <w:tcW w:w="829" w:type="dxa"/>
+          </w:tcPr>
+          <w:p>
+            <w:pPr/>
+            <w:r>
+              <w:t xml:space="preserve">127</w:t>
+            </w:r>
+          </w:p>
+        </w:tc>
+        <w:tc>
+          <w:tcPr>
+            <w:tcW w:w="1826" w:type="dxa"/>
+          </w:tcPr>
+          <w:p>
+            <w:pPr/>
+            <w:r>
+              <w:t xml:space="preserve">49</w:t>
+            </w:r>
+          </w:p>
+        </w:tc>
+        <w:tc>
+          <w:tcPr>
+            <w:tcW w:w="4415" w:type="dxa"/>
+          </w:tcPr>
+          <w:p>
+            <w:pPr/>
+            <w:r>
+              <w:rPr>
+                <w:rStyle w:val="CodeChar"/>
+              </w:rPr>
+              <w:t xml:space="preserve">CA L EOA 20/0/1500</w:t>
+            </w:r>
+            <w:r>
+              <w:t xml:space="preserve">, </w:t>
+            </w:r>
+            <w:r>
+              <w:rPr>
+                <w:rStyle w:val="CodeChar"/>
+              </w:rPr>
+              <w:t xml:space="preserve">CA L EC EOA 30/20%/2500</w:t>
+            </w:r>
+          </w:p>
+        </w:tc>
+      </w:tr>
+      <w:tr>
+        <w:tc>
+          <w:tcPr>
+            <w:tcW w:w="2290" w:type="dxa"/>
+          </w:tcPr>
+          <w:p>
+            <w:pPr/>
+            <w:r>
               <w:t xml:space="preserve">POS</w:t>
             </w:r>
           </w:p>
@@ -2664,65 +2731,53 @@
           <w:p>
             <w:pPr/>
             <w:r>
+              <w:t xml:space="preserve">EPO</w:t>
+            </w:r>
+          </w:p>
+        </w:tc>
+        <w:tc>
+          <w:tcPr>
+            <w:tcW w:w="829" w:type="dxa"/>
+          </w:tcPr>
+          <w:p>
+            <w:pPr/>
+            <w:r>
+              <w:t xml:space="preserve">0</w:t>
+            </w:r>
+          </w:p>
+        </w:tc>
+        <w:tc>
+          <w:tcPr>
+            <w:tcW w:w="1826" w:type="dxa"/>
+          </w:tcPr>
+          <w:p>
+            <w:pPr/>
+            <w:r>
+              <w:t xml:space="preserve">0</w:t>
+            </w:r>
+          </w:p>
+        </w:tc>
+        <w:tc>
+          <w:tcPr>
+            <w:tcW w:w="4415" w:type="dxa"/>
+          </w:tcPr>
+          <w:p>
+            <w:pPr/>
+            <w:r>
+              <w:t xml:space="preserve">none</w:t>
+            </w:r>
+          </w:p>
+        </w:tc>
+      </w:tr>
+      <w:tr>
+        <w:tc>
+          <w:tcPr>
+            <w:tcW w:w="2290" w:type="dxa"/>
+          </w:tcPr>
+          <w:p>
+            <w:pPr/>
+            <w:r>
               <w:t xml:space="preserve">OTHER/UNKNOWN</w:t>
-            </w:r>
-          </w:p>
-        </w:tc>
-        <w:tc>
-          <w:tcPr>
-            <w:tcW w:w="829" w:type="dxa"/>
-          </w:tcPr>
-          <w:p>
-            <w:pPr/>
-            <w:r>
-              <w:t xml:space="preserve">130</w:t>
-            </w:r>
-          </w:p>
-        </w:tc>
-        <w:tc>
-          <w:tcPr>
-            <w:tcW w:w="1826" w:type="dxa"/>
-          </w:tcPr>
-          <w:p>
-            <w:pPr/>
-            <w:r>
-              <w:t xml:space="preserve">52</w:t>
-            </w:r>
-          </w:p>
-        </w:tc>
-        <w:tc>
-          <w:tcPr>
-            <w:tcW w:w="4415" w:type="dxa"/>
-          </w:tcPr>
-          <w:p>
-            <w:pPr/>
-            <w:r>
-              <w:rPr>
-                <w:rStyle w:val="CodeChar"/>
-              </w:rPr>
-              <w:t xml:space="preserve">CA L EOA 20/0/1500</w:t>
-            </w:r>
-            <w:r>
-              <w:t xml:space="preserve">, </w:t>
-            </w:r>
-            <w:r>
-              <w:rPr>
-                <w:rStyle w:val="CodeChar"/>
-              </w:rPr>
-              <w:t xml:space="preserve">CA L CUS PPO SACRAMENTO CITY USD- EPO</w:t>
-            </w:r>
-          </w:p>
-        </w:tc>
-      </w:tr>
-      <w:tr>
-        <w:tc>
-          <w:tcPr>
-            <w:tcW w:w="2290" w:type="dxa"/>
-          </w:tcPr>
-          <w:p>
-            <w:pPr/>
-            <w:r>
-              <w:t xml:space="preserve">EPO</w:t>
             </w:r>
           </w:p>
         </w:tc>
@@ -2845,7 +2900,7 @@
         </w:numPr>
       </w:pPr>
       <w:r>
-        <w:t xml:space="preserve">598 of the HMO-word plans also carry a confirmed HMO family name. None of the 453 PPO plans carries any HMO family name.</w:t>
+        <w:t xml:space="preserve">513 of the HMO-word plans also carry a confirmed HMO family name. None of the 456 PPO plans carries any HMO family name.</w:t>
       </w:r>
     </w:p>
     <w:p>
@@ -2860,19 +2915,10 @@
         <w:rPr>
           <w:b/>
         </w:rPr>
-        <w:t xml:space="preserve">POS, 6 plans.</w:t>
-      </w:r>
-      <w:r>
-        <w:t xml:space="preserve"> All are custom employer plans with an explicit POS word. </w:t>
-      </w:r>
-      <w:r>
-        <w:rPr>
-          <w:rStyle w:val="CodeChar"/>
-        </w:rPr>
-        <w:t xml:space="preserve">UC POST DOC</w:t>
-      </w:r>
-      <w:r>
-        <w:t xml:space="preserve"> plans are correctly not counted as POS.</w:t>
+        <w:t xml:space="preserve">EOA, 127 plans.</w:t>
+      </w:r>
+      <w:r>
+        <w:t xml:space="preserve"> The organizers confirmed EOA is a separate network, not PPO. None of these names has a PPO word.</w:t>
       </w:r>
     </w:p>
     <w:p>
@@ -2887,10 +2933,37 @@
         <w:rPr>
           <w:b/>
         </w:rPr>
+        <w:t xml:space="preserve">POS, 6 plans.</w:t>
+      </w:r>
+      <w:r>
+        <w:t xml:space="preserve"> All are custom employer plans with an explicit POS word. </w:t>
+      </w:r>
+      <w:r>
+        <w:rPr>
+          <w:rStyle w:val="CodeChar"/>
+        </w:rPr>
+        <w:t xml:space="preserve">UC POST DOC</w:t>
+      </w:r>
+      <w:r>
+        <w:t xml:space="preserve"> plans are correctly not counted as POS.</w:t>
+      </w:r>
+    </w:p>
+    <w:p>
+      <w:pPr>
+        <w:pStyle w:val="ListParagraph"/>
+        <w:numPr>
+          <w:ilvl w:val="0"/>
+          <w:numId w:val="5"/>
+        </w:numPr>
+      </w:pPr>
+      <w:r>
+        <w:rPr>
+          <w:b/>
+        </w:rPr>
         <w:t xml:space="preserve">EPO, 0 plans.</w:t>
       </w:r>
       <w:r>
-        <w:t xml:space="preserve"> EPO appears only in 3 names that also say PPO (Ironworkers FWP, Sacramento City USD). They are flagged as conflicts, not counted as PPO.</w:t>
+        <w:t xml:space="preserve"> EPO appears only in 3 names that also say PPO (Ironworkers FWP, Sacramento City USD). The organizers confirmed these count as PPO, so they are in the PPO network.</w:t>
       </w:r>
     </w:p>
     <w:p>
@@ -3033,7 +3106,16 @@
           <w:p>
             <w:pPr/>
             <w:r>
-              <w:t xml:space="preserve">Confirmed for 8 families: SC, SAL, EC, WholeCare, CalChoice, SmartCare, Full Network, Salud</w:t>
+              <w:t xml:space="preserve">Confirmed for 7 families: SC, SAL, WholeCare, CalChoice, SmartCare, Full Network, Salud. </w:t>
+            </w:r>
+            <w:r>
+              <w:rPr>
+                <w:rStyle w:val="CodeChar"/>
+              </w:rPr>
+              <w:t xml:space="preserve">EC</w:t>
+            </w:r>
+            <w:r>
+              <w:t xml:space="preserve"> rejected: it appears on both HMO and EOA plans</w:t>
             </w:r>
           </w:p>
         </w:tc>
@@ -3057,7 +3139,7 @@
           <w:p>
             <w:pPr/>
             <w:r>
-              <w:t xml:space="preserve">Mostly rejected: 4-part pattern is PPO 91% of the time, 3-part is HMO 87%</w:t>
+              <w:t xml:space="preserve">Mostly rejected: 4-part pattern is PPO 87% of the time, 3-part is HMO 72%</w:t>
             </w:r>
           </w:p>
         </w:tc>
@@ -3146,7 +3228,7 @@
     <w:p>
       <w:pPr/>
       <w:r>
-        <w:t xml:space="preserve">About 130 of the 1,312 in-scope plans (10%) depend on answers the data can't give. Until those answers come, the pipeline takes the cautious option and flags the case; each answer is a one-line config change.</w:t>
+        <w:t xml:space="preserve">The organizers have answered the two questions that changed the PPO count: EOA is a separate network, and plans named both PPO and EPO count as PPO. The rest don't change the PPO plan list, but they do affect C3 and data quality.</w:t>
       </w:r>
     </w:p>
     <w:tbl>
@@ -3158,9 +3240,9 @@
       </w:tblPr>
       <w:tblGrid>
         <w:gridCol w:w="720"/>
-        <w:gridCol w:w="2428"/>
-        <w:gridCol w:w="2914"/>
-        <w:gridCol w:w="1636"/>
+        <w:gridCol w:w="2465"/>
+        <w:gridCol w:w="2732"/>
+        <w:gridCol w:w="1781"/>
         <w:gridCol w:w="1662"/>
       </w:tblGrid>
       <w:tr>
@@ -3181,7 +3263,7 @@
         </w:tc>
         <w:tc>
           <w:tcPr>
-            <w:tcW w:w="2428" w:type="dxa"/>
+            <w:tcW w:w="2465" w:type="dxa"/>
             <w:shd w:val="clear" w:color="auto" w:fill="F2F2F2"/>
           </w:tcPr>
           <w:p>
@@ -3193,7 +3275,7 @@
         </w:tc>
         <w:tc>
           <w:tcPr>
-            <w:tcW w:w="2914" w:type="dxa"/>
+            <w:tcW w:w="2732" w:type="dxa"/>
             <w:shd w:val="clear" w:color="auto" w:fill="F2F2F2"/>
           </w:tcPr>
           <w:p>
@@ -3205,13 +3287,13 @@
         </w:tc>
         <w:tc>
           <w:tcPr>
-            <w:tcW w:w="1636" w:type="dxa"/>
+            <w:tcW w:w="1781" w:type="dxa"/>
             <w:shd w:val="clear" w:color="auto" w:fill="F2F2F2"/>
           </w:tcPr>
           <w:p>
             <w:pPr/>
             <w:r>
-              <w:t xml:space="preserve">Current handling</w:t>
+              <w:t xml:space="preserve">Status / handling</w:t>
             </w:r>
           </w:p>
         </w:tc>
@@ -3242,7 +3324,7 @@
         </w:tc>
         <w:tc>
           <w:tcPr>
-            <w:tcW w:w="2428" w:type="dxa"/>
+            <w:tcW w:w="2465" w:type="dxa"/>
           </w:tcPr>
           <w:p>
             <w:pPr/>
@@ -3262,7 +3344,7 @@
         </w:tc>
         <w:tc>
           <w:tcPr>
-            <w:tcW w:w="2914" w:type="dxa"/>
+            <w:tcW w:w="2732" w:type="dxa"/>
           </w:tcPr>
           <w:p>
             <w:pPr/>
@@ -3275,8 +3357,338 @@
               </w:rPr>
               <w:t xml:space="preserve">CA L EOA 20/0/1500</w:t>
             </w:r>
-            <w:r>
-              <w:t xml:space="preserve">; 55 also carry </w:t>
+          </w:p>
+        </w:tc>
+        <w:tc>
+          <w:tcPr>
+            <w:tcW w:w="1781" w:type="dxa"/>
+          </w:tcPr>
+          <w:p>
+            <w:pPr/>
+            <w:r>
+              <w:rPr>
+                <w:b/>
+              </w:rPr>
+              <w:t xml:space="preserve">Answered:</w:t>
+            </w:r>
+            <w:r>
+              <w:t xml:space="preserve"> separate network, not PPO (</w:t>
+            </w:r>
+            <w:r>
+              <w:rPr>
+                <w:rStyle w:val="CodeChar"/>
+              </w:rPr>
+              <w:t xml:space="preserve">eoa_as: eoa</w:t>
+            </w:r>
+            <w:r>
+              <w:t xml:space="preserve">)</w:t>
+            </w:r>
+          </w:p>
+        </w:tc>
+        <w:tc>
+          <w:tcPr>
+            <w:tcW w:w="1662" w:type="dxa"/>
+          </w:tcPr>
+          <w:p>
+            <w:pPr/>
+            <w:r>
+              <w:t xml:space="preserve">127 plans ruled out of PPO</w:t>
+            </w:r>
+          </w:p>
+        </w:tc>
+      </w:tr>
+      <w:tr>
+        <w:tc>
+          <w:tcPr>
+            <w:tcW w:w="720" w:type="dxa"/>
+          </w:tcPr>
+          <w:p>
+            <w:pPr/>
+            <w:r>
+              <w:t xml:space="preserve">2</w:t>
+            </w:r>
+          </w:p>
+        </w:tc>
+        <w:tc>
+          <w:tcPr>
+            <w:tcW w:w="2465" w:type="dxa"/>
+          </w:tcPr>
+          <w:p>
+            <w:pPr/>
+            <w:r>
+              <w:t xml:space="preserve">Are plans named both PPO and EPO a PPO plan or an EPO plan?</w:t>
+            </w:r>
+          </w:p>
+        </w:tc>
+        <w:tc>
+          <w:tcPr>
+            <w:tcW w:w="2732" w:type="dxa"/>
+          </w:tcPr>
+          <w:p>
+            <w:pPr/>
+            <w:r>
+              <w:t xml:space="preserve">3 plans: Ironworkers FWP EPO$15 / EPO$10, Sacramento City USD EPO</w:t>
+            </w:r>
+          </w:p>
+        </w:tc>
+        <w:tc>
+          <w:tcPr>
+            <w:tcW w:w="1781" w:type="dxa"/>
+          </w:tcPr>
+          <w:p>
+            <w:pPr/>
+            <w:r>
+              <w:rPr>
+                <w:b/>
+              </w:rPr>
+              <w:t xml:space="preserve">Answered:</w:t>
+            </w:r>
+            <w:r>
+              <w:t xml:space="preserve"> PPO (</w:t>
+            </w:r>
+            <w:r>
+              <w:rPr>
+                <w:rStyle w:val="CodeChar"/>
+              </w:rPr>
+              <w:t xml:space="preserve">ppo_epo_as: ppo</w:t>
+            </w:r>
+            <w:r>
+              <w:t xml:space="preserve">)</w:t>
+            </w:r>
+          </w:p>
+        </w:tc>
+        <w:tc>
+          <w:tcPr>
+            <w:tcW w:w="1662" w:type="dxa"/>
+          </w:tcPr>
+          <w:p>
+            <w:pPr/>
+            <w:r>
+              <w:t xml:space="preserve">PPO 453 → 456</w:t>
+            </w:r>
+          </w:p>
+        </w:tc>
+      </w:tr>
+      <w:tr>
+        <w:tc>
+          <w:tcPr>
+            <w:tcW w:w="720" w:type="dxa"/>
+          </w:tcPr>
+          <w:p>
+            <w:pPr/>
+            <w:r>
+              <w:t xml:space="preserve">3</w:t>
+            </w:r>
+          </w:p>
+        </w:tc>
+        <w:tc>
+          <w:tcPr>
+            <w:tcW w:w="2465" w:type="dxa"/>
+          </w:tcPr>
+          <w:p>
+            <w:pPr/>
+            <w:r>
+              <w:t xml:space="preserve">Is a PPO-only rate file expected, or should C3 filter the PPO network inside the shared CA file?</w:t>
+            </w:r>
+          </w:p>
+        </w:tc>
+        <w:tc>
+          <w:tcPr>
+            <w:tcW w:w="2732" w:type="dxa"/>
+          </w:tcPr>
+          <w:p>
+            <w:pPr/>
+            <w:r>
+              <w:t xml:space="preserve">All 1,312 CA plans point to </w:t>
+            </w:r>
+            <w:r>
+              <w:rPr>
+                <w:rStyle w:val="CodeChar"/>
+              </w:rPr>
+              <w:t xml:space="preserve">healthnet-ca_in-network.json</w:t>
+            </w:r>
+            <w:r>
+              <w:t xml:space="preserve"> (about 702 MB)</w:t>
+            </w:r>
+          </w:p>
+        </w:tc>
+        <w:tc>
+          <w:tcPr>
+            <w:tcW w:w="1781" w:type="dxa"/>
+          </w:tcPr>
+          <w:p>
+            <w:pPr/>
+            <w:r>
+              <w:t xml:space="preserve">Open; file labelled MIXED and passed on with the 456 PPO plan keys</w:t>
+            </w:r>
+          </w:p>
+        </w:tc>
+        <w:tc>
+          <w:tcPr>
+            <w:tcW w:w="1662" w:type="dxa"/>
+          </w:tcPr>
+          <w:p>
+            <w:pPr/>
+            <w:r>
+              <w:t xml:space="preserve">Decides the C3 design</w:t>
+            </w:r>
+          </w:p>
+        </w:tc>
+      </w:tr>
+      <w:tr>
+        <w:tc>
+          <w:tcPr>
+            <w:tcW w:w="720" w:type="dxa"/>
+          </w:tcPr>
+          <w:p>
+            <w:pPr/>
+            <w:r>
+              <w:t xml:space="preserve">4</w:t>
+            </w:r>
+          </w:p>
+        </w:tc>
+        <w:tc>
+          <w:tcPr>
+            <w:tcW w:w="2465" w:type="dxa"/>
+          </w:tcPr>
+          <w:p>
+            <w:pPr/>
+            <w:r>
+              <w:t xml:space="preserve">Are TIN name prefixes like </w:t>
+            </w:r>
+            <w:r>
+              <w:rPr>
+                <w:rStyle w:val="CodeChar"/>
+              </w:rPr>
+              <w:t xml:space="preserve">PPO: Los Angeles County</w:t>
+            </w:r>
+            <w:r>
+              <w:t xml:space="preserve"> real network tags?</w:t>
+            </w:r>
+          </w:p>
+        </w:tc>
+        <w:tc>
+          <w:tcPr>
+            <w:tcW w:w="2732" w:type="dxa"/>
+          </w:tcPr>
+          <w:p>
+            <w:pPr/>
+            <w:r>
+              <w:rPr>
+                <w:rStyle w:val="CodeChar"/>
+              </w:rPr>
+              <w:t xml:space="preserve">network_name</w:t>
+            </w:r>
+            <w:r>
+              <w:t xml:space="preserve"> empty in the 40 MB sample; </w:t>
+            </w:r>
+            <w:r>
+              <w:rPr>
+                <w:rStyle w:val="CodeChar"/>
+              </w:rPr>
+              <w:t xml:space="preserve">PPO:</w:t>
+            </w:r>
+            <w:r>
+              <w:t xml:space="preserve"> on 1.9% of groups; </w:t>
+            </w:r>
+            <w:r>
+              <w:rPr>
+                <w:rStyle w:val="CodeChar"/>
+              </w:rPr>
+              <w:t xml:space="preserve">DIRECT NETWORK: AMBETTER PPO/HMO</w:t>
+            </w:r>
+            <w:r>
+              <w:t xml:space="preserve"> also appears</w:t>
+            </w:r>
+          </w:p>
+        </w:tc>
+        <w:tc>
+          <w:tcPr>
+            <w:tcW w:w="1781" w:type="dxa"/>
+          </w:tcPr>
+          <w:p>
+            <w:pPr/>
+            <w:r>
+              <w:t xml:space="preserve">Open; recorded as weak evidence only</w:t>
+            </w:r>
+          </w:p>
+        </w:tc>
+        <w:tc>
+          <w:tcPr>
+            <w:tcW w:w="1662" w:type="dxa"/>
+          </w:tcPr>
+          <w:p>
+            <w:pPr/>
+            <w:r>
+              <w:t xml:space="preserve">Possible in-file filter for C3</w:t>
+            </w:r>
+          </w:p>
+        </w:tc>
+      </w:tr>
+      <w:tr>
+        <w:tc>
+          <w:tcPr>
+            <w:tcW w:w="720" w:type="dxa"/>
+          </w:tcPr>
+          <w:p>
+            <w:pPr/>
+            <w:r>
+              <w:t xml:space="preserve">5</w:t>
+            </w:r>
+          </w:p>
+        </w:tc>
+        <w:tc>
+          <w:tcPr>
+            <w:tcW w:w="2465" w:type="dxa"/>
+          </w:tcPr>
+          <w:p>
+            <w:pPr/>
+            <w:r>
+              <w:t xml:space="preserve">What do the plan-name codes mean?</w:t>
+            </w:r>
+          </w:p>
+        </w:tc>
+        <w:tc>
+          <w:tcPr>
+            <w:tcW w:w="2732" w:type="dxa"/>
+          </w:tcPr>
+          <w:p>
+            <w:pPr/>
+            <w:r>
+              <w:rPr>
+                <w:rStyle w:val="CodeChar"/>
+              </w:rPr>
+              <w:t xml:space="preserve">CA L</w:t>
+            </w:r>
+            <w:r>
+              <w:t xml:space="preserve"> / </w:t>
+            </w:r>
+            <w:r>
+              <w:rPr>
+                <w:rStyle w:val="CodeChar"/>
+              </w:rPr>
+              <w:t xml:space="preserve">CA T</w:t>
+            </w:r>
+            <w:r>
+              <w:t xml:space="preserve"> / </w:t>
+            </w:r>
+            <w:r>
+              <w:rPr>
+                <w:rStyle w:val="CodeChar"/>
+              </w:rPr>
+              <w:t xml:space="preserve">CA L&amp;T</w:t>
+            </w:r>
+            <w:r>
+              <w:t xml:space="preserve">, </w:t>
+            </w:r>
+            <w:r>
+              <w:rPr>
+                <w:rStyle w:val="CodeChar"/>
+              </w:rPr>
+              <w:t xml:space="preserve">SC</w:t>
+            </w:r>
+            <w:r>
+              <w:t xml:space="preserve">, </w:t>
             </w:r>
             <w:r>
               <w:rPr>
@@ -3285,27 +3697,87 @@
               <w:t xml:space="preserve">EC</w:t>
             </w:r>
             <w:r>
-              <w:t xml:space="preserve">, which is otherwise HMO-only (85/85)</w:t>
-            </w:r>
-          </w:p>
-        </w:tc>
-        <w:tc>
-          <w:tcPr>
-            <w:tcW w:w="1636" w:type="dxa"/>
-          </w:tcPr>
-          <w:p>
-            <w:pPr/>
-            <w:r>
-              <w:t xml:space="preserve">Unknown, excluded from PPO (</w:t>
-            </w:r>
-            <w:r>
-              <w:rPr>
-                <w:rStyle w:val="CodeChar"/>
-              </w:rPr>
-              <w:t xml:space="preserve">eoa_as: unknown</w:t>
-            </w:r>
-            <w:r>
-              <w:t xml:space="preserve">)</w:t>
+              <w:t xml:space="preserve">, </w:t>
+            </w:r>
+            <w:r>
+              <w:rPr>
+                <w:rStyle w:val="CodeChar"/>
+              </w:rPr>
+              <w:t xml:space="preserve">SAL</w:t>
+            </w:r>
+            <w:r>
+              <w:t xml:space="preserve">, </w:t>
+            </w:r>
+            <w:r>
+              <w:rPr>
+                <w:rStyle w:val="CodeChar"/>
+              </w:rPr>
+              <w:t xml:space="preserve">CUS</w:t>
+            </w:r>
+            <w:r>
+              <w:t xml:space="preserve">, </w:t>
+            </w:r>
+            <w:r>
+              <w:rPr>
+                <w:rStyle w:val="CodeChar"/>
+              </w:rPr>
+              <w:t xml:space="preserve">CBA</w:t>
+            </w:r>
+            <w:r>
+              <w:t xml:space="preserve">, </w:t>
+            </w:r>
+            <w:r>
+              <w:rPr>
+                <w:rStyle w:val="CodeChar"/>
+              </w:rPr>
+              <w:t xml:space="preserve">GF</w:t>
+            </w:r>
+            <w:r>
+              <w:t xml:space="preserve">, </w:t>
+            </w:r>
+            <w:r>
+              <w:rPr>
+                <w:rStyle w:val="CodeChar"/>
+              </w:rPr>
+              <w:t xml:space="preserve">INF</w:t>
+            </w:r>
+            <w:r>
+              <w:t xml:space="preserve">, </w:t>
+            </w:r>
+            <w:r>
+              <w:rPr>
+                <w:rStyle w:val="CodeChar"/>
+              </w:rPr>
+              <w:t xml:space="preserve">Aon NCA/SCA</w:t>
+            </w:r>
+            <w:r>
+              <w:t xml:space="preserve">, </w:t>
+            </w:r>
+            <w:r>
+              <w:rPr>
+                <w:rStyle w:val="CodeChar"/>
+              </w:rPr>
+              <w:t xml:space="preserve">Mex</w:t>
+            </w:r>
+          </w:p>
+        </w:tc>
+        <w:tc>
+          <w:tcPr>
+            <w:tcW w:w="1781" w:type="dxa"/>
+          </w:tcPr>
+          <w:p>
+            <w:pPr/>
+            <w:r>
+              <w:t xml:space="preserve">Open; </w:t>
+            </w:r>
+            <w:r>
+              <w:rPr>
+                <w:rStyle w:val="CodeChar"/>
+              </w:rPr>
+              <w:t xml:space="preserve">SAL</w:t>
+            </w:r>
+            <w:r>
+              <w:t xml:space="preserve"> treated as Salud HMO (163/163 in data)</w:t>
             </w:r>
           </w:p>
         </w:tc>
@@ -3316,7 +3788,7 @@
           <w:p>
             <w:pPr/>
             <w:r>
-              <w:t xml:space="preserve">PPO 453 → 580 if EOA is PPO</w:t>
+              <w:t xml:space="preserve">4 plans</w:t>
             </w:r>
           </w:p>
         </w:tc>
@@ -3329,49 +3801,61 @@
           <w:p>
             <w:pPr/>
             <w:r>
-              <w:t xml:space="preserve">2</w:t>
-            </w:r>
-          </w:p>
-        </w:tc>
-        <w:tc>
-          <w:tcPr>
-            <w:tcW w:w="2428" w:type="dxa"/>
-          </w:tcPr>
-          <w:p>
-            <w:pPr/>
-            <w:r>
-              <w:t xml:space="preserve">Are plans named both PPO and EPO a PPO plan or an EPO plan?</w:t>
-            </w:r>
-          </w:p>
-        </w:tc>
-        <w:tc>
-          <w:tcPr>
-            <w:tcW w:w="2914" w:type="dxa"/>
-          </w:tcPr>
-          <w:p>
-            <w:pPr/>
-            <w:r>
-              <w:t xml:space="preserve">3 plans: Ironworkers FWP EPO$15 / EPO$10, Sacramento City USD EPO</w:t>
-            </w:r>
-          </w:p>
-        </w:tc>
-        <w:tc>
-          <w:tcPr>
-            <w:tcW w:w="1636" w:type="dxa"/>
-          </w:tcPr>
-          <w:p>
-            <w:pPr/>
-            <w:r>
-              <w:t xml:space="preserve">Conflict, excluded (</w:t>
-            </w:r>
-            <w:r>
-              <w:rPr>
-                <w:rStyle w:val="CodeChar"/>
-              </w:rPr>
-              <w:t xml:space="preserve">ppo_epo_as: conflict</w:t>
-            </w:r>
-            <w:r>
-              <w:t xml:space="preserve">)</w:t>
+              <w:t xml:space="preserve">6</w:t>
+            </w:r>
+          </w:p>
+        </w:tc>
+        <w:tc>
+          <w:tcPr>
+            <w:tcW w:w="2465" w:type="dxa"/>
+          </w:tcPr>
+          <w:p>
+            <w:pPr/>
+            <w:r>
+              <w:t xml:space="preserve">Is </w:t>
+            </w:r>
+            <w:r>
+              <w:rPr>
+                <w:rStyle w:val="CodeChar"/>
+              </w:rPr>
+              <w:t xml:space="preserve">CUSPPO</w:t>
+            </w:r>
+            <w:r>
+              <w:t xml:space="preserve"> a typo for </w:t>
+            </w:r>
+            <w:r>
+              <w:rPr>
+                <w:rStyle w:val="CodeChar"/>
+              </w:rPr>
+              <w:t xml:space="preserve">CUS PPO</w:t>
+            </w:r>
+            <w:r>
+              <w:t xml:space="preserve">?</w:t>
+            </w:r>
+          </w:p>
+        </w:tc>
+        <w:tc>
+          <w:tcPr>
+            <w:tcW w:w="2732" w:type="dxa"/>
+          </w:tcPr>
+          <w:p>
+            <w:pPr/>
+            <w:r>
+              <w:rPr>
+                <w:rStyle w:val="CodeChar"/>
+              </w:rPr>
+              <w:t xml:space="preserve">CA L CUSPPO 15/250/20% RAP</w:t>
+            </w:r>
+          </w:p>
+        </w:tc>
+        <w:tc>
+          <w:tcPr>
+            <w:tcW w:w="1781" w:type="dxa"/>
+          </w:tcPr>
+          <w:p>
+            <w:pPr/>
+            <w:r>
+              <w:t xml:space="preserve">Open; PPO, medium confidence</w:t>
             </w:r>
           </w:p>
         </w:tc>
@@ -3382,7 +3866,7 @@
           <w:p>
             <w:pPr/>
             <w:r>
-              <w:t xml:space="preserve">±3 plans</w:t>
+              <w:t xml:space="preserve">1 plan</w:t>
             </w:r>
           </w:p>
         </w:tc>
@@ -3395,49 +3879,40 @@
           <w:p>
             <w:pPr/>
             <w:r>
-              <w:t xml:space="preserve">3</w:t>
-            </w:r>
-          </w:p>
-        </w:tc>
-        <w:tc>
-          <w:tcPr>
-            <w:tcW w:w="2428" w:type="dxa"/>
-          </w:tcPr>
-          <w:p>
-            <w:pPr/>
-            <w:r>
-              <w:t xml:space="preserve">Is a PPO-only rate file expected, or should C3 filter the PPO network inside the shared CA file?</w:t>
-            </w:r>
-          </w:p>
-        </w:tc>
-        <w:tc>
-          <w:tcPr>
-            <w:tcW w:w="2914" w:type="dxa"/>
-          </w:tcPr>
-          <w:p>
-            <w:pPr/>
-            <w:r>
-              <w:t xml:space="preserve">All 1,312 CA plans point to </w:t>
-            </w:r>
-            <w:r>
-              <w:rPr>
-                <w:rStyle w:val="CodeChar"/>
-              </w:rPr>
-              <w:t xml:space="preserve">healthnet-ca_in-network.json</w:t>
-            </w:r>
-            <w:r>
-              <w:t xml:space="preserve"> (about 702 MB)</w:t>
-            </w:r>
-          </w:p>
-        </w:tc>
-        <w:tc>
-          <w:tcPr>
-            <w:tcW w:w="1636" w:type="dxa"/>
-          </w:tcPr>
-          <w:p>
-            <w:pPr/>
-            <w:r>
-              <w:t xml:space="preserve">File labelled MIXED and passed on with the 453 PPO plan keys</w:t>
+              <w:t xml:space="preserve">7</w:t>
+            </w:r>
+          </w:p>
+        </w:tc>
+        <w:tc>
+          <w:tcPr>
+            <w:tcW w:w="2465" w:type="dxa"/>
+          </w:tcPr>
+          <w:p>
+            <w:pPr/>
+            <w:r>
+              <w:t xml:space="preserve">Which field is right when plan ID type and ID value disagree?</w:t>
+            </w:r>
+          </w:p>
+        </w:tc>
+        <w:tc>
+          <w:tcPr>
+            <w:tcW w:w="2732" w:type="dxa"/>
+          </w:tcPr>
+          <w:p>
+            <w:pPr/>
+            <w:r>
+              <w:t xml:space="preserve">154 EIN-typed IDs look like HIOS; 308 group plans typed HIOS</w:t>
+            </w:r>
+          </w:p>
+        </w:tc>
+        <w:tc>
+          <w:tcPr>
+            <w:tcW w:w="1781" w:type="dxa"/>
+          </w:tcPr>
+          <w:p>
+            <w:pPr/>
+            <w:r>
+              <w:t xml:space="preserve">Open; flagged, market field used as given</w:t>
             </w:r>
           </w:p>
         </w:tc>
@@ -3448,7 +3923,7 @@
           <w:p>
             <w:pPr/>
             <w:r>
-              <w:t xml:space="preserve">Decides the C3 design</w:t>
+              <w:t xml:space="preserve">Data quality only</w:t>
             </w:r>
           </w:p>
         </w:tc>
@@ -3461,73 +3936,46 @@
           <w:p>
             <w:pPr/>
             <w:r>
-              <w:t xml:space="preserve">4</w:t>
-            </w:r>
-          </w:p>
-        </w:tc>
-        <w:tc>
-          <w:tcPr>
-            <w:tcW w:w="2428" w:type="dxa"/>
-          </w:tcPr>
-          <w:p>
-            <w:pPr/>
-            <w:r>
-              <w:t xml:space="preserve">Are TIN name prefixes like </w:t>
-            </w:r>
-            <w:r>
-              <w:rPr>
-                <w:rStyle w:val="CodeChar"/>
-              </w:rPr>
-              <w:t xml:space="preserve">PPO: Los Angeles County</w:t>
-            </w:r>
-            <w:r>
-              <w:t xml:space="preserve"> real network tags?</w:t>
-            </w:r>
-          </w:p>
-        </w:tc>
-        <w:tc>
-          <w:tcPr>
-            <w:tcW w:w="2914" w:type="dxa"/>
-          </w:tcPr>
-          <w:p>
-            <w:pPr/>
-            <w:r>
-              <w:rPr>
-                <w:rStyle w:val="CodeChar"/>
-              </w:rPr>
-              <w:t xml:space="preserve">network_name</w:t>
-            </w:r>
-            <w:r>
-              <w:t xml:space="preserve"> empty in the 40 MB sample; </w:t>
-            </w:r>
-            <w:r>
-              <w:rPr>
-                <w:rStyle w:val="CodeChar"/>
-              </w:rPr>
-              <w:t xml:space="preserve">PPO:</w:t>
-            </w:r>
-            <w:r>
-              <w:t xml:space="preserve"> on 1.9% of groups; </w:t>
-            </w:r>
-            <w:r>
-              <w:rPr>
-                <w:rStyle w:val="CodeChar"/>
-              </w:rPr>
-              <w:t xml:space="preserve">DIRECT NETWORK: AMBETTER PPO/HMO</w:t>
-            </w:r>
-            <w:r>
-              <w:t xml:space="preserve"> also appears</w:t>
-            </w:r>
-          </w:p>
-        </w:tc>
-        <w:tc>
-          <w:tcPr>
-            <w:tcW w:w="1636" w:type="dxa"/>
-          </w:tcPr>
-          <w:p>
-            <w:pPr/>
-            <w:r>
-              <w:t xml:space="preserve">Recorded as weak evidence only</w:t>
+              <w:t xml:space="preserve">8</w:t>
+            </w:r>
+          </w:p>
+        </w:tc>
+        <w:tc>
+          <w:tcPr>
+            <w:tcW w:w="2465" w:type="dxa"/>
+          </w:tcPr>
+          <w:p>
+            <w:pPr/>
+            <w:r>
+              <w:t xml:space="preserve">Is there a plan-to-licensed-entity mapping (Health Net of California vs Health Net Life)?</w:t>
+            </w:r>
+          </w:p>
+        </w:tc>
+        <w:tc>
+          <w:tcPr>
+            <w:tcW w:w="2732" w:type="dxa"/>
+          </w:tcPr>
+          <w:p>
+            <w:pPr/>
+            <w:r>
+              <w:rPr>
+                <w:rStyle w:val="CodeChar"/>
+              </w:rPr>
+              <w:t xml:space="preserve">issuer_name</w:t>
+            </w:r>
+            <w:r>
+              <w:t xml:space="preserve"> is "Healthnet, LLC" for all 1,693 plans</w:t>
+            </w:r>
+          </w:p>
+        </w:tc>
+        <w:tc>
+          <w:tcPr>
+            <w:tcW w:w="1781" w:type="dxa"/>
+          </w:tcPr>
+          <w:p>
+            <w:pPr/>
+            <w:r>
+              <w:t xml:space="preserve">Open; hypothesis not testable</w:t>
             </w:r>
           </w:p>
         </w:tc>
@@ -3538,7 +3986,7 @@
           <w:p>
             <w:pPr/>
             <w:r>
-              <w:t xml:space="preserve">Possible in-file filter for C3</w:t>
+              <w:t xml:space="preserve">Could confirm PPO vs HMO independently</w:t>
             </w:r>
           </w:p>
         </w:tc>
@@ -3551,376 +3999,13 @@
           <w:p>
             <w:pPr/>
             <w:r>
-              <w:t xml:space="preserve">5</w:t>
-            </w:r>
-          </w:p>
-        </w:tc>
-        <w:tc>
-          <w:tcPr>
-            <w:tcW w:w="2428" w:type="dxa"/>
-          </w:tcPr>
-          <w:p>
-            <w:pPr/>
-            <w:r>
-              <w:t xml:space="preserve">What do the plan-name codes mean?</w:t>
-            </w:r>
-          </w:p>
-        </w:tc>
-        <w:tc>
-          <w:tcPr>
-            <w:tcW w:w="2914" w:type="dxa"/>
-          </w:tcPr>
-          <w:p>
-            <w:pPr/>
-            <w:r>
-              <w:rPr>
-                <w:rStyle w:val="CodeChar"/>
-              </w:rPr>
-              <w:t xml:space="preserve">CA L</w:t>
-            </w:r>
-            <w:r>
-              <w:t xml:space="preserve"> / </w:t>
-            </w:r>
-            <w:r>
-              <w:rPr>
-                <w:rStyle w:val="CodeChar"/>
-              </w:rPr>
-              <w:t xml:space="preserve">CA T</w:t>
-            </w:r>
-            <w:r>
-              <w:t xml:space="preserve"> / </w:t>
-            </w:r>
-            <w:r>
-              <w:rPr>
-                <w:rStyle w:val="CodeChar"/>
-              </w:rPr>
-              <w:t xml:space="preserve">CA L&amp;T</w:t>
-            </w:r>
-            <w:r>
-              <w:t xml:space="preserve">, </w:t>
-            </w:r>
-            <w:r>
-              <w:rPr>
-                <w:rStyle w:val="CodeChar"/>
-              </w:rPr>
-              <w:t xml:space="preserve">SC</w:t>
-            </w:r>
-            <w:r>
-              <w:t xml:space="preserve">, </w:t>
-            </w:r>
-            <w:r>
-              <w:rPr>
-                <w:rStyle w:val="CodeChar"/>
-              </w:rPr>
-              <w:t xml:space="preserve">EC</w:t>
-            </w:r>
-            <w:r>
-              <w:t xml:space="preserve">, </w:t>
-            </w:r>
-            <w:r>
-              <w:rPr>
-                <w:rStyle w:val="CodeChar"/>
-              </w:rPr>
-              <w:t xml:space="preserve">SAL</w:t>
-            </w:r>
-            <w:r>
-              <w:t xml:space="preserve">, </w:t>
-            </w:r>
-            <w:r>
-              <w:rPr>
-                <w:rStyle w:val="CodeChar"/>
-              </w:rPr>
-              <w:t xml:space="preserve">CUS</w:t>
-            </w:r>
-            <w:r>
-              <w:t xml:space="preserve">, </w:t>
-            </w:r>
-            <w:r>
-              <w:rPr>
-                <w:rStyle w:val="CodeChar"/>
-              </w:rPr>
-              <w:t xml:space="preserve">CBA</w:t>
-            </w:r>
-            <w:r>
-              <w:t xml:space="preserve">, </w:t>
-            </w:r>
-            <w:r>
-              <w:rPr>
-                <w:rStyle w:val="CodeChar"/>
-              </w:rPr>
-              <w:t xml:space="preserve">GF</w:t>
-            </w:r>
-            <w:r>
-              <w:t xml:space="preserve">, </w:t>
-            </w:r>
-            <w:r>
-              <w:rPr>
-                <w:rStyle w:val="CodeChar"/>
-              </w:rPr>
-              <w:t xml:space="preserve">INF</w:t>
-            </w:r>
-            <w:r>
-              <w:t xml:space="preserve">, </w:t>
-            </w:r>
-            <w:r>
-              <w:rPr>
-                <w:rStyle w:val="CodeChar"/>
-              </w:rPr>
-              <w:t xml:space="preserve">Aon NCA/SCA</w:t>
-            </w:r>
-            <w:r>
-              <w:t xml:space="preserve">, </w:t>
-            </w:r>
-            <w:r>
-              <w:rPr>
-                <w:rStyle w:val="CodeChar"/>
-              </w:rPr>
-              <w:t xml:space="preserve">Mex</w:t>
-            </w:r>
-          </w:p>
-        </w:tc>
-        <w:tc>
-          <w:tcPr>
-            <w:tcW w:w="1636" w:type="dxa"/>
-          </w:tcPr>
-          <w:p>
-            <w:pPr/>
-            <w:r>
-              <w:rPr>
-                <w:rStyle w:val="CodeChar"/>
-              </w:rPr>
-              <w:t xml:space="preserve">SAL</w:t>
-            </w:r>
-            <w:r>
-              <w:t xml:space="preserve"> treated as Salud HMO (163/163 in data)</w:t>
-            </w:r>
-          </w:p>
-        </w:tc>
-        <w:tc>
-          <w:tcPr>
-            <w:tcW w:w="1662" w:type="dxa"/>
-          </w:tcPr>
-          <w:p>
-            <w:pPr/>
-            <w:r>
-              <w:t xml:space="preserve">4 plans</w:t>
-            </w:r>
-          </w:p>
-        </w:tc>
-      </w:tr>
-      <w:tr>
-        <w:tc>
-          <w:tcPr>
-            <w:tcW w:w="720" w:type="dxa"/>
-          </w:tcPr>
-          <w:p>
-            <w:pPr/>
-            <w:r>
-              <w:t xml:space="preserve">6</w:t>
-            </w:r>
-          </w:p>
-        </w:tc>
-        <w:tc>
-          <w:tcPr>
-            <w:tcW w:w="2428" w:type="dxa"/>
-          </w:tcPr>
-          <w:p>
-            <w:pPr/>
-            <w:r>
-              <w:t xml:space="preserve">Is </w:t>
-            </w:r>
-            <w:r>
-              <w:rPr>
-                <w:rStyle w:val="CodeChar"/>
-              </w:rPr>
-              <w:t xml:space="preserve">CUSPPO</w:t>
-            </w:r>
-            <w:r>
-              <w:t xml:space="preserve"> a typo for </w:t>
-            </w:r>
-            <w:r>
-              <w:rPr>
-                <w:rStyle w:val="CodeChar"/>
-              </w:rPr>
-              <w:t xml:space="preserve">CUS PPO</w:t>
-            </w:r>
-            <w:r>
-              <w:t xml:space="preserve">?</w:t>
-            </w:r>
-          </w:p>
-        </w:tc>
-        <w:tc>
-          <w:tcPr>
-            <w:tcW w:w="2914" w:type="dxa"/>
-          </w:tcPr>
-          <w:p>
-            <w:pPr/>
-            <w:r>
-              <w:rPr>
-                <w:rStyle w:val="CodeChar"/>
-              </w:rPr>
-              <w:t xml:space="preserve">CA L CUSPPO 15/250/20% RAP</w:t>
-            </w:r>
-          </w:p>
-        </w:tc>
-        <w:tc>
-          <w:tcPr>
-            <w:tcW w:w="1636" w:type="dxa"/>
-          </w:tcPr>
-          <w:p>
-            <w:pPr/>
-            <w:r>
-              <w:t xml:space="preserve">PPO, medium confidence</w:t>
-            </w:r>
-          </w:p>
-        </w:tc>
-        <w:tc>
-          <w:tcPr>
-            <w:tcW w:w="1662" w:type="dxa"/>
-          </w:tcPr>
-          <w:p>
-            <w:pPr/>
-            <w:r>
-              <w:t xml:space="preserve">1 plan</w:t>
-            </w:r>
-          </w:p>
-        </w:tc>
-      </w:tr>
-      <w:tr>
-        <w:tc>
-          <w:tcPr>
-            <w:tcW w:w="720" w:type="dxa"/>
-          </w:tcPr>
-          <w:p>
-            <w:pPr/>
-            <w:r>
-              <w:t xml:space="preserve">7</w:t>
-            </w:r>
-          </w:p>
-        </w:tc>
-        <w:tc>
-          <w:tcPr>
-            <w:tcW w:w="2428" w:type="dxa"/>
-          </w:tcPr>
-          <w:p>
-            <w:pPr/>
-            <w:r>
-              <w:t xml:space="preserve">Which field is right when plan ID type and ID value disagree?</w:t>
-            </w:r>
-          </w:p>
-        </w:tc>
-        <w:tc>
-          <w:tcPr>
-            <w:tcW w:w="2914" w:type="dxa"/>
-          </w:tcPr>
-          <w:p>
-            <w:pPr/>
-            <w:r>
-              <w:t xml:space="preserve">154 EIN-typed IDs look like HIOS; 308 group plans typed HIOS</w:t>
-            </w:r>
-          </w:p>
-        </w:tc>
-        <w:tc>
-          <w:tcPr>
-            <w:tcW w:w="1636" w:type="dxa"/>
-          </w:tcPr>
-          <w:p>
-            <w:pPr/>
-            <w:r>
-              <w:t xml:space="preserve">Flagged; market field used as given</w:t>
-            </w:r>
-          </w:p>
-        </w:tc>
-        <w:tc>
-          <w:tcPr>
-            <w:tcW w:w="1662" w:type="dxa"/>
-          </w:tcPr>
-          <w:p>
-            <w:pPr/>
-            <w:r>
-              <w:t xml:space="preserve">Data quality only</w:t>
-            </w:r>
-          </w:p>
-        </w:tc>
-      </w:tr>
-      <w:tr>
-        <w:tc>
-          <w:tcPr>
-            <w:tcW w:w="720" w:type="dxa"/>
-          </w:tcPr>
-          <w:p>
-            <w:pPr/>
-            <w:r>
-              <w:t xml:space="preserve">8</w:t>
-            </w:r>
-          </w:p>
-        </w:tc>
-        <w:tc>
-          <w:tcPr>
-            <w:tcW w:w="2428" w:type="dxa"/>
-          </w:tcPr>
-          <w:p>
-            <w:pPr/>
-            <w:r>
-              <w:t xml:space="preserve">Is there a plan-to-licensed-entity mapping (Health Net of California vs Health Net Life)?</w:t>
-            </w:r>
-          </w:p>
-        </w:tc>
-        <w:tc>
-          <w:tcPr>
-            <w:tcW w:w="2914" w:type="dxa"/>
-          </w:tcPr>
-          <w:p>
-            <w:pPr/>
-            <w:r>
-              <w:rPr>
-                <w:rStyle w:val="CodeChar"/>
-              </w:rPr>
-              <w:t xml:space="preserve">issuer_name</w:t>
-            </w:r>
-            <w:r>
-              <w:t xml:space="preserve"> is "Healthnet, LLC" for all 1,693 plans</w:t>
-            </w:r>
-          </w:p>
-        </w:tc>
-        <w:tc>
-          <w:tcPr>
-            <w:tcW w:w="1636" w:type="dxa"/>
-          </w:tcPr>
-          <w:p>
-            <w:pPr/>
-            <w:r>
-              <w:t xml:space="preserve">Hypothesis not testable</w:t>
-            </w:r>
-          </w:p>
-        </w:tc>
-        <w:tc>
-          <w:tcPr>
-            <w:tcW w:w="1662" w:type="dxa"/>
-          </w:tcPr>
-          <w:p>
-            <w:pPr/>
-            <w:r>
-              <w:t xml:space="preserve">Could confirm PPO vs HMO independently</w:t>
-            </w:r>
-          </w:p>
-        </w:tc>
-      </w:tr>
-      <w:tr>
-        <w:tc>
-          <w:tcPr>
-            <w:tcW w:w="720" w:type="dxa"/>
-          </w:tcPr>
-          <w:p>
-            <w:pPr/>
-            <w:r>
               <w:t xml:space="preserve">9</w:t>
             </w:r>
           </w:p>
         </w:tc>
         <w:tc>
           <w:tcPr>
-            <w:tcW w:w="2428" w:type="dxa"/>
+            <w:tcW w:w="2465" w:type="dxa"/>
           </w:tcPr>
           <w:p>
             <w:pPr/>
@@ -3931,7 +4016,7 @@
         </w:tc>
         <w:tc>
           <w:tcPr>
-            <w:tcW w:w="2914" w:type="dxa"/>
+            <w:tcW w:w="2732" w:type="dxa"/>
           </w:tcPr>
           <w:p>
             <w:pPr/>
@@ -3957,12 +4042,12 @@
         </w:tc>
         <w:tc>
           <w:tcPr>
-            <w:tcW w:w="1636" w:type="dxa"/>
-          </w:tcPr>
-          <w:p>
-            <w:pPr/>
-            <w:r>
-              <w:t xml:space="preserve">Deduplicated</w:t>
+            <w:tcW w:w="1781" w:type="dxa"/>
+          </w:tcPr>
+          <w:p>
+            <w:pPr/>
+            <w:r>
+              <w:t xml:space="preserve">Open; deduplicated</w:t>
             </w:r>
           </w:p>
         </w:tc>
@@ -4927,7 +5012,7 @@
         </w:numPr>
       </w:pPr>
       <w:r>
-        <w:t xml:space="preserve">130 in-scope plans (about 10%) can't be resolved from public index data.</w:t>
+        <w:t xml:space="preserve">130 plans (EOA and PPO+EPO) are classified by the organizers' answers, not by evidence in the public data.</w:t>
       </w:r>
     </w:p>
     <w:p>
@@ -4972,7 +5057,7 @@
         </w:numPr>
       </w:pPr>
       <w:r>
-        <w:t xml:space="preserve">☐ Send the 9 open questions to the organizers, starting with EOA (Q1) and the PPO-only filtering approach (Q3)</w:t>
+        <w:t xml:space="preserve">☒ Get the organizers' answers on EOA and PPO+EPO plans, and apply them</w:t>
       </w:r>
     </w:p>
     <w:p>
@@ -4984,7 +5069,7 @@
         </w:numPr>
       </w:pPr>
       <w:r>
-        <w:t xml:space="preserve">☐ Commit the C1 and C2 code, docs and outputs, and push to GitHub</w:t>
+        <w:t xml:space="preserve">☐ Ask the remaining open questions, starting with the PPO-only filtering approach (Q3)</w:t>
       </w:r>
     </w:p>
     <w:p>
@@ -4996,16 +5081,7 @@
         </w:numPr>
       </w:pPr>
       <w:r>
-        <w:t xml:space="preserve">☐ C3: stream the CA rate file and keep only rates tied to the 453 PPO plans (</w:t>
-      </w:r>
-      <w:r>
-        <w:rPr>
-          <w:rStyle w:val="CodeChar"/>
-        </w:rPr>
-        <w:t xml:space="preserve">outputs/c2/ppo_plans.csv</w:t>
-      </w:r>
-      <w:r>
-        <w:t xml:space="preserve">)</w:t>
+        <w:t xml:space="preserve">☐ Add the NPPES and reference files to the repo for C3</w:t>
       </w:r>
     </w:p>
     <w:p>
@@ -5017,25 +5093,28 @@
         </w:numPr>
       </w:pPr>
       <w:r>
-        <w:t xml:space="preserve">☐ Add the NPPES files to </w:t>
+        <w:t xml:space="preserve">☐ C3: score every rate file used on the quality metrics</w:t>
+      </w:r>
+    </w:p>
+    <w:p>
+      <w:pPr>
+        <w:pStyle w:val="ListParagraph"/>
+        <w:numPr>
+          <w:ilvl w:val="0"/>
+          <w:numId w:val="11"/>
+        </w:numPr>
+      </w:pPr>
+      <w:r>
+        <w:t xml:space="preserve">☐ Stream the CA rate file and keep only rates tied to the 456 PPO plans (</w:t>
       </w:r>
       <w:r>
         <w:rPr>
           <w:rStyle w:val="CodeChar"/>
         </w:rPr>
-        <w:t xml:space="preserve">data/nppes/</w:t>
-      </w:r>
-      <w:r>
-        <w:t xml:space="preserve"> and re-run with </w:t>
-      </w:r>
-      <w:r>
-        <w:rPr>
-          <w:rStyle w:val="CodeChar"/>
-        </w:rPr>
-        <w:t xml:space="preserve">--fingerprint</w:t>
-      </w:r>
-      <w:r>
-        <w:t xml:space="preserve"> to get the California share of providers</w:t>
+        <w:t xml:space="preserve">outputs/c2/ppo_plans.csv</w:t>
+      </w:r>
+      <w:r>
+        <w:t xml:space="preserve">)</w:t>
       </w:r>
     </w:p>
     <w:sectPr>

</xml_diff>